<commit_message>
Update the developer guide: the PHR locker no longer depends on this repo
The PHR app used to import this project's server package at runtime for
its whole consent and data-flow chain. It no longer does -- it runs as its
own registered ABDM entity with its own client id, callback URL, port and
section 6/7 stack.

Records what the three locker-driven changes here are still for
(initiate_consent_request's optional hip/careContexts, the per-HIU
auto-trigger allowlist, EXTRA_ALLOWED_AZP), and that all three now serve
the MOUNTED deployment only. Also documents the dummy EMR Postgres
migration tool.

Co-Authored-By: Claude Opus 5 <noreply@anthropic.com>
</commit_message>
<xml_diff>
--- a/ABDM_Backend_Developer_Guide.docx
+++ b/ABDM_Backend_Developer_Guide.docx
@@ -7220,6 +7220,60 @@
           <w:szCs w:val="20"/>
         </w:rPr>
         <w:t xml:space="preserve">Most non-obvious decisions in this codebase carry a dated comment explaining what was confirmed against the spec, what was confirmed against a live capture, and what is still unverified. A docstring flagging something as UNCONFIRMED is a to-do, not a disclaimer.</w:t>
+      </w:r>
+    </w:p>
+    <w:p>
+      <w:pPr>
+        <w:pStyle w:val="Heading1"/>
+      </w:pPr>
+      <w:r>
+        <w:t>8. The PHR locker no longer depends on this repository</w:t>
+      </w:r>
+    </w:p>
+    <w:p>
+      <w:r>
+        <w:t>The PHR app used to import this project's server package at runtime for its whole consent and data-flow chain. It no longer does: it runs as its own registered ABDM entity, with its own client id, callback URL, port and section 6/7 stack. Nothing in this repository is required for it to work, and nothing here should be changed on its behalf again.</w:t>
+      </w:r>
+    </w:p>
+    <w:p>
+      <w:pPr>
+        <w:pStyle w:val="Heading2"/>
+      </w:pPr>
+      <w:r>
+        <w:t>What was added here for the locker, and what it is still for</w:t>
+      </w:r>
+    </w:p>
+    <w:p>
+      <w:r>
+        <w:t>initiate_consent_request() in hiu_consent.py takes optional hip_id and care_contexts, sent as literal null when absent. Additive -- every existing caller is unchanged. An 8.3.11 alert names the exact HIP and care contexts that became available, and a consent raised in response should cover those rather than everything.</w:t>
+      </w:r>
+    </w:p>
+    <w:p>
+      <w:r>
+        <w:t>HEALTH_INFORMATION_AUTO_TRIGGER_HIU_IDS in config.py is a per-HIU allowlist that bypasses the global trigger mode, so one HIU's consents can fetch data automatically without turning auto-trigger on for every HIU. health_information_trigger.py's _do_trigger() is extracted unchanged from what auto mode did inline, so the allowlist path and the mode path cannot drift apart.</w:t>
+      </w:r>
+    </w:p>
+    <w:p>
+      <w:r>
+        <w:t>EXTRA_ALLOWED_AZP in jwt_auth.py accepts additional azp claim values on inbound callbacks, read from the environment and empty by default. ABDM's Health Locker callbacks arrive correctly signed but carrying azp=TEST_PHR, a service account beyond 'gateway' and our own client id, and were rejected 401 without this. Signature, iss and exp are still verified against ABDM's live JWKS before azp is inspected, so the security boundary is unchanged: a caller without ABDM's signing key cannot present any azp value at all.</w:t>
+      </w:r>
+    </w:p>
+    <w:p>
+      <w:r>
+        <w:t>All three now serve the MOUNTED deployment only. The standalone locker calls none of them.</w:t>
+      </w:r>
+    </w:p>
+    <w:p>
+      <w:pPr>
+        <w:pStyle w:val="Heading2"/>
+      </w:pPr>
+      <w:r>
+        <w:t>tools/migrate_dummy_emr_to_postgres.py</w:t>
+      </w:r>
+    </w:p>
+    <w:p>
+      <w:r>
+        <w:t>Moves the 13-CSV dummy EMR fixture dataset and patient_records.csv into Postgres -- 1185 rows, idempotent, inserted in foreign-key order so a partial run can simply be re-run.</w:t>
       </w:r>
     </w:p>
     <w:sectPr>

</xml_diff>